<commit_message>
Say military criminal offences, not martial-law violations
The JAG bullet in the English CV read "Investigated and prosecuted
martial-law violations". Martial law means a declared state of
emergency rule, which is not what the service covered and reads oddly
to an English speaker for Korea in 2009-2014. Changed at the author's
instruction to "military criminal offences", and applied to the two
other places the same service is described — the PROFILE paragraph and
the representative-matters entry — so the three agree.

Co-Authored-By: Claude Opus 5 <noreply@anthropic.com>
Claude-Session: https://claude.ai/code/session_01YHwKGZ2ofa4vyN8HJ5sf9e
</commit_message>
<xml_diff>
--- a/career/submission/CV_YoungHan_LEE_Coupang_GlobalInvestigations.docx
+++ b/career/submission/CV_YoungHan_LEE_Coupang_GlobalInvestigations.docx
@@ -150,7 +150,7 @@
         <w:rPr>
           <w:rFonts w:ascii="Times New Roman" w:hAnsi="Times New Roman" w:cs="Times New Roman"/>
         </w:rPr>
-        <w:t xml:space="preserve">Korean and Washington, D.C. attorney with seventeen years of practice spanning criminal investigation and prosecution, evidence discovery in contested proceedings, corporate criminal and regulatory defence, and group-wide legal and governance oversight. Began practice as a Judge Advocate in the Republic of Korea Army, investigating and prosecuting criminal matters and advising commanders of the ROK–US Combined Forces Command, United Nations Command and U.S. Forces Korea. Later led discovery and motions practice in a U.S. International Trade Commission investigation involving trade-secret misappropriation and patent infringement — taking and defending depositions, drafting the motion for default and sanctions, securing sanctions against the opposing party and sustaining the resulting default judgment before the Commission. Represented companies and their executives, including the former Head of Korea of Merrill Lynch, in Korean criminal and regulatory proceedings. Currently Chief Strategy Officer and Chief Legal Officer of d’strict, developer and operator of ARTE MUSEUM, overseeing regulatory and criminal proceedings, board governance and overseas-entity compliance across Korea, the United States, Japan, Taiwan and China, and directing U.S. listing preparation with a Big Four advisor including related-party clean-up, disclosure readiness and internal accounting control. Earlier practice at Dentons (Washington, D.C. and Seoul) and Bae, Kim &amp; Lee also covered cross-border M&amp;A and private equity, international arbitration, and financial, AML/CFT and technology regulation. Admitted in Korea (2009) and Washington, D.C. (2014); passed the U.S. CPA examination (AICPA, Maine, 2012); Certified Securities Investment Advisor, Certified Derivatives Investment Advisor and Certified Collective Investment Manager of the Korea Financial Investment Association. Holds a Master of Laws in Securities Law and Commercial Law from Seoul National University and further LL.M.s from Georgetown and Northwestern. Full professional fluency in Korean and English; business-level Japanese.</w:t>
+        <w:t xml:space="preserve">Korean and Washington, D.C. attorney with seventeen years of practice spanning criminal investigation and prosecution, evidence discovery in contested proceedings, corporate criminal and regulatory defence, and group-wide legal and governance oversight. Began practice as a Judge Advocate in the Republic of Korea Army, investigating and prosecuting military criminal offences and advising commanders of the ROK–US Combined Forces Command, United Nations Command and U.S. Forces Korea. Later led discovery and motions practice in a U.S. International Trade Commission investigation involving trade-secret misappropriation and patent infringement — taking and defending depositions, drafting the motion for default and sanctions, securing sanctions against the opposing party and sustaining the resulting default judgment before the Commission. Represented companies and their executives, including the former Head of Korea of Merrill Lynch, in Korean criminal and regulatory proceedings. Currently Chief Strategy Officer and Chief Legal Officer of d’strict, developer and operator of ARTE MUSEUM, overseeing regulatory and criminal proceedings, board governance and overseas-entity compliance across Korea, the United States, Japan, Taiwan and China, and directing U.S. listing preparation with a Big Four advisor including related-party clean-up, disclosure readiness and internal accounting control. Earlier practice at Dentons (Washington, D.C. and Seoul) and Bae, Kim &amp; Lee also covered cross-border M&amp;A and private equity, international arbitration, and financial, AML/CFT and technology regulation. Admitted in Korea (2009) and Washington, D.C. (2014); passed the U.S. CPA examination (AICPA, Maine, 2012); Certified Securities Investment Advisor, Certified Derivatives Investment Advisor and Certified Collective Investment Manager of the Korea Financial Investment Association. Holds a Master of Laws in Securities Law and Commercial Law from Seoul National University and further LL.M.s from Georgetown and Northwestern. Full professional fluency in Korean and English; business-level Japanese.</w:t>
       </w:r>
     </w:p>
     <w:p>
@@ -1733,7 +1733,7 @@
           <w:rFonts w:ascii="Times New Roman" w:hAnsi="Times New Roman" w:cs="Times New Roman"/>
           <w:szCs w:val="21"/>
         </w:rPr>
-        <w:t>Investigated and prosecuted martial-law violations.</w:t>
+        <w:t>Investigated and prosecuted military criminal offences.</w:t>
       </w:r>
     </w:p>
     <w:p>
@@ -3054,7 +3054,7 @@
           <w:szCs w:val="21"/>
           <w:lang w:eastAsia="ko-KR"/>
         </w:rPr>
-        <w:t xml:space="preserve">As a Judge Advocate in the Republic of Korea Army, investigated and prosecuted criminal matters.</w:t>
+        <w:t xml:space="preserve">As a Judge Advocate in the Republic of Korea Army, investigated and prosecuted military criminal offences.</w:t>
       </w:r>
     </w:p>
     <w:p>

</xml_diff>